<commit_message>
Fill in Team Member Contribution table
Qusai: reviewed code/pipeline/results. Laith: wrote the report.
Mohammad: prepared the presentation slides.

Co-Authored-By: Claude Sonnet 5 <noreply@anthropic.com>
Claude-Session: https://claude.ai/code/session_01Hyh2qqZGiLCWK1LFycCvKR
</commit_message>
<xml_diff>
--- a/report/Spoken_IEEE_Report.docx
+++ b/report/Spoken_IEEE_Report.docx
@@ -2462,7 +2462,7 @@
                 <w:sz w:val="16"/>
                 <w:szCs w:val="16"/>
               </w:rPr>
-              <w:t xml:space="preserve">[to be completed with the team]</w:t>
+              <w:t xml:space="preserve">Reviewed and validated the code, pipeline, and experimental results.</w:t>
             </w:r>
           </w:p>
         </w:tc>
@@ -2518,7 +2518,7 @@
                 <w:sz w:val="16"/>
                 <w:szCs w:val="16"/>
               </w:rPr>
-              <w:t xml:space="preserve">[to be completed with the team]</w:t>
+              <w:t xml:space="preserve">Wrote the final report.</w:t>
             </w:r>
           </w:p>
         </w:tc>
@@ -2574,7 +2574,7 @@
                 <w:sz w:val="16"/>
                 <w:szCs w:val="16"/>
               </w:rPr>
-              <w:t xml:space="preserve">[to be completed with the team]</w:t>
+              <w:t xml:space="preserve">Prepared the presentation slides.</w:t>
             </w:r>
           </w:p>
         </w:tc>

</xml_diff>